<commit_message>
Ref to Git added
</commit_message>
<xml_diff>
--- a/РПЗ Длютров РТ5-41.docx
+++ b/РПЗ Длютров РТ5-41.docx
@@ -111,7 +111,7 @@
                     </wp:anchor>
                   </w:drawing>
                 </mc:Choice>
-                <mc:Fallback xmlns:oel="http://schemas.microsoft.com/office/2019/extlst" xmlns:w16cex="http://schemas.microsoft.com/office/word/2018/wordml/cex" xmlns:w16="http://schemas.microsoft.com/office/word/2018/wordml" xmlns:w16du="http://schemas.microsoft.com/office/word/2023/wordml/word16du" xmlns:w16sdtdh="http://schemas.microsoft.com/office/word/2020/wordml/sdtdatahash" xmlns:w16sdtfl="http://schemas.microsoft.com/office/word/2024/wordml/sdtformatlock" xmlns:a="http://schemas.openxmlformats.org/drawingml/2006/main" xmlns:w16se="http://schemas.microsoft.com/office/word/2015/wordml/symex" xmlns:w16cid="http://schemas.microsoft.com/office/word/2016/wordml/cid" xmlns:am3d="http://schemas.microsoft.com/office/drawing/2017/model3d" xmlns:aink="http://schemas.microsoft.com/office/drawing/2016/ink" xmlns:cx8="http://schemas.microsoft.com/office/drawing/2016/5/14/chartex" xmlns:cx7="http://schemas.microsoft.com/office/drawing/2016/5/13/chartex" xmlns:cx6="http://schemas.microsoft.com/office/drawing/2016/5/12/chartex" xmlns:cx5="http://schemas.microsoft.com/office/drawing/2016/5/11/chartex" xmlns:cx4="http://schemas.microsoft.com/office/drawing/2016/5/10/chartex" xmlns:cx3="http://schemas.microsoft.com/office/drawing/2016/5/9/chartex" xmlns:cx2="http://schemas.microsoft.com/office/drawing/2015/10/21/chartex" xmlns:cx1="http://schemas.microsoft.com/office/drawing/2015/9/8/chartex" xmlns:cx="http://schemas.microsoft.com/office/drawing/2014/chartex">
+                <mc:Fallback xmlns:cx="http://schemas.microsoft.com/office/drawing/2014/chartex" xmlns:cx1="http://schemas.microsoft.com/office/drawing/2015/9/8/chartex" xmlns:cx2="http://schemas.microsoft.com/office/drawing/2015/10/21/chartex" xmlns:cx3="http://schemas.microsoft.com/office/drawing/2016/5/9/chartex" xmlns:cx4="http://schemas.microsoft.com/office/drawing/2016/5/10/chartex" xmlns:cx5="http://schemas.microsoft.com/office/drawing/2016/5/11/chartex" xmlns:cx6="http://schemas.microsoft.com/office/drawing/2016/5/12/chartex" xmlns:cx7="http://schemas.microsoft.com/office/drawing/2016/5/13/chartex" xmlns:cx8="http://schemas.microsoft.com/office/drawing/2016/5/14/chartex" xmlns:aink="http://schemas.microsoft.com/office/drawing/2016/ink" xmlns:am3d="http://schemas.microsoft.com/office/drawing/2017/model3d" xmlns:w16cid="http://schemas.microsoft.com/office/word/2016/wordml/cid" xmlns:w16se="http://schemas.microsoft.com/office/word/2015/wordml/symex" xmlns:a="http://schemas.openxmlformats.org/drawingml/2006/main" xmlns:w16sdtfl="http://schemas.microsoft.com/office/word/2024/wordml/sdtformatlock" xmlns:w16sdtdh="http://schemas.microsoft.com/office/word/2020/wordml/sdtdatahash" xmlns:w16du="http://schemas.microsoft.com/office/word/2023/wordml/word16du" xmlns:w16="http://schemas.microsoft.com/office/word/2018/wordml" xmlns:w16cex="http://schemas.microsoft.com/office/word/2018/wordml/cex" xmlns:oel="http://schemas.microsoft.com/office/2019/extlst">
                   <w:pict>
                     <v:shapetype type="#_x0000_t75" o:spt="75" coordsize="21600,21600" o:preferrelative="t" path="m@4@5l@4@11@9@11@9@5xe">
                       <v:formulas>
@@ -3841,7 +3841,6 @@
           <w:rFonts w:ascii="Times New Roman" w:eastAsia="Times New Roman" w:hAnsi="Times New Roman" w:cs="Times New Roman"/>
           <w:sz w:val="28"/>
           <w:szCs w:val="24"/>
-          <w:lang w:val="en-US"/>
         </w:rPr>
         <w:t xml:space="preserve"> [2]</w:t>
       </w:r>
@@ -5483,7 +5482,6 @@
           <w:rFonts w:ascii="Times New Roman" w:eastAsia="Times New Roman" w:hAnsi="Times New Roman" w:cs="Times New Roman"/>
           <w:sz w:val="28"/>
           <w:szCs w:val="24"/>
-          <w:lang w:val="en-US"/>
         </w:rPr>
       </w:pPr>
       <w:r>
@@ -9313,8 +9311,6 @@
         </w:rPr>
         <w:t xml:space="preserve"> [3]</w:t>
       </w:r>
-      <w:bookmarkStart w:id="6" w:name="_GoBack"/>
-      <w:bookmarkEnd w:id="6"/>
       <w:r>
         <w:rPr>
           <w:rFonts w:ascii="Times New Roman" w:eastAsia="Times New Roman" w:hAnsi="Times New Roman" w:cs="Times New Roman"/>
@@ -12049,7 +12045,7 @@
           <w:lang w:eastAsia="ru-RU"/>
         </w:rPr>
       </w:pPr>
-      <w:bookmarkStart w:id="7" w:name="undefined"/>
+      <w:bookmarkStart w:id="6" w:name="undefined"/>
       <w:r>
         <w:rPr>
           <w:lang w:eastAsia="ru-RU"/>
@@ -12153,7 +12149,7 @@
         </w:rPr>
         <w:t>й лабораторной работы.</w:t>
       </w:r>
-      <w:bookmarkEnd w:id="7"/>
+      <w:bookmarkEnd w:id="6"/>
     </w:p>
     <w:p>
       <w:pPr>
@@ -14069,6 +14065,120 @@
     </w:p>
     <w:p>
       <w:pPr>
+        <w:pStyle w:val="af0"/>
+        <w:tabs>
+          <w:tab w:val="left" w:pos="993"/>
+        </w:tabs>
+        <w:spacing w:line="360" w:lineRule="auto"/>
+        <w:ind w:left="0" w:firstLine="709"/>
+        <w:jc w:val="both"/>
+        <w:rPr>
+          <w:rFonts w:ascii="Times New Roman" w:hAnsi="Times New Roman" w:cs="Times New Roman"/>
+          <w:sz w:val="28"/>
+          <w:szCs w:val="28"/>
+          <w:lang w:eastAsia="ru-RU"/>
+        </w:rPr>
+      </w:pPr>
+      <w:r>
+        <w:rPr>
+          <w:rFonts w:ascii="Times New Roman" w:hAnsi="Times New Roman" w:cs="Times New Roman"/>
+          <w:sz w:val="28"/>
+          <w:szCs w:val="28"/>
+          <w:lang w:eastAsia="ru-RU"/>
+        </w:rPr>
+        <w:t xml:space="preserve">Ссылка на </w:t>
+      </w:r>
+      <w:r>
+        <w:rPr>
+          <w:rFonts w:ascii="Times New Roman" w:hAnsi="Times New Roman" w:cs="Times New Roman"/>
+          <w:sz w:val="28"/>
+          <w:szCs w:val="28"/>
+          <w:lang w:val="en-US" w:eastAsia="ru-RU"/>
+        </w:rPr>
+        <w:t>GitHub</w:t>
+      </w:r>
+      <w:r>
+        <w:rPr>
+          <w:rFonts w:ascii="Times New Roman" w:hAnsi="Times New Roman" w:cs="Times New Roman"/>
+          <w:sz w:val="28"/>
+          <w:szCs w:val="28"/>
+          <w:lang w:eastAsia="ru-RU"/>
+        </w:rPr>
+        <w:t xml:space="preserve"> </w:t>
+      </w:r>
+      <w:r>
+        <w:rPr>
+          <w:rFonts w:ascii="Times New Roman" w:hAnsi="Times New Roman" w:cs="Times New Roman"/>
+          <w:sz w:val="28"/>
+          <w:szCs w:val="28"/>
+          <w:lang w:eastAsia="ru-RU"/>
+        </w:rPr>
+        <w:t>со всеми</w:t>
+      </w:r>
+      <w:r>
+        <w:rPr>
+          <w:rFonts w:ascii="Times New Roman" w:hAnsi="Times New Roman" w:cs="Times New Roman"/>
+          <w:sz w:val="28"/>
+          <w:szCs w:val="28"/>
+          <w:lang w:eastAsia="ru-RU"/>
+        </w:rPr>
+        <w:t xml:space="preserve"> готовыми</w:t>
+      </w:r>
+      <w:bookmarkStart w:id="7" w:name="_GoBack"/>
+      <w:bookmarkEnd w:id="7"/>
+      <w:r>
+        <w:rPr>
+          <w:rFonts w:ascii="Times New Roman" w:hAnsi="Times New Roman" w:cs="Times New Roman"/>
+          <w:sz w:val="28"/>
+          <w:szCs w:val="28"/>
+          <w:lang w:eastAsia="ru-RU"/>
+        </w:rPr>
+        <w:t xml:space="preserve"> лабораторными работами: </w:t>
+      </w:r>
+      <w:hyperlink r:id="rId65" w:history="1">
+        <w:r>
+          <w:rPr>
+            <w:rStyle w:val="af7"/>
+            <w:rFonts w:ascii="Times New Roman" w:hAnsi="Times New Roman" w:cs="Times New Roman"/>
+            <w:sz w:val="28"/>
+            <w:szCs w:val="28"/>
+            <w:lang w:eastAsia="ru-RU"/>
+          </w:rPr>
+          <w:t>https://github.com/Natriy228/Net-Appl</w:t>
+        </w:r>
+        <w:r>
+          <w:rPr>
+            <w:rStyle w:val="af7"/>
+            <w:rFonts w:ascii="Times New Roman" w:hAnsi="Times New Roman" w:cs="Times New Roman"/>
+            <w:sz w:val="28"/>
+            <w:szCs w:val="28"/>
+            <w:lang w:eastAsia="ru-RU"/>
+          </w:rPr>
+          <w:t>i</w:t>
+        </w:r>
+        <w:r>
+          <w:rPr>
+            <w:rStyle w:val="af7"/>
+            <w:rFonts w:ascii="Times New Roman" w:hAnsi="Times New Roman" w:cs="Times New Roman"/>
+            <w:sz w:val="28"/>
+            <w:szCs w:val="28"/>
+            <w:lang w:eastAsia="ru-RU"/>
+          </w:rPr>
+          <w:t>cations</w:t>
+        </w:r>
+      </w:hyperlink>
+      <w:r>
+        <w:rPr>
+          <w:rFonts w:ascii="Times New Roman" w:hAnsi="Times New Roman" w:cs="Times New Roman"/>
+          <w:sz w:val="28"/>
+          <w:szCs w:val="28"/>
+          <w:lang w:eastAsia="ru-RU"/>
+        </w:rPr>
+        <w:t>.</w:t>
+      </w:r>
+    </w:p>
+    <w:p>
+      <w:pPr>
         <w:rPr>
           <w:rFonts w:ascii="Times New Roman" w:hAnsi="Times New Roman" w:cs="Times New Roman"/>
           <w:sz w:val="28"/>
@@ -14134,16 +14244,7 @@
           <w:sz w:val="28"/>
           <w:szCs w:val="28"/>
         </w:rPr>
-        <w:t>Сайт московского паркинга</w:t>
-      </w:r>
-      <w:r>
-        <w:rPr>
-          <w:rFonts w:ascii="Times New Roman" w:hAnsi="Times New Roman" w:cs="Times New Roman"/>
-          <w:color w:val="000000" w:themeColor="text1"/>
-          <w:sz w:val="28"/>
-          <w:szCs w:val="28"/>
-        </w:rPr>
-        <w:t xml:space="preserve"> [Электронный ресурс]. – </w:t>
+        <w:t xml:space="preserve">Сайт московского паркинга [Электронный ресурс]. – </w:t>
       </w:r>
       <w:r>
         <w:rPr>
@@ -14180,16 +14281,7 @@
           <w:sz w:val="28"/>
           <w:szCs w:val="28"/>
         </w:rPr>
-        <w:t>(дата обращения: 19.03.2026</w:t>
-      </w:r>
-      <w:r>
-        <w:rPr>
-          <w:rFonts w:ascii="Times New Roman" w:hAnsi="Times New Roman" w:cs="Times New Roman"/>
-          <w:color w:val="000000" w:themeColor="text1"/>
-          <w:sz w:val="28"/>
-          <w:szCs w:val="28"/>
-        </w:rPr>
-        <w:t>)</w:t>
+        <w:t>(дата обращения: 19.03.2026)</w:t>
       </w:r>
     </w:p>
     <w:p>
@@ -14243,15 +14335,7 @@
           <w:sz w:val="28"/>
           <w:szCs w:val="28"/>
         </w:rPr>
-        <w:t>(дата обращения: 31.05.2026</w:t>
-      </w:r>
-      <w:r>
-        <w:rPr>
-          <w:rFonts w:ascii="Times New Roman" w:eastAsia="Times New Roman" w:hAnsi="Times New Roman" w:cs="Times New Roman"/>
-          <w:sz w:val="28"/>
-          <w:szCs w:val="28"/>
-        </w:rPr>
-        <w:t>)</w:t>
+        <w:t>(дата обращения: 31.05.2026)</w:t>
       </w:r>
     </w:p>
     <w:p>
@@ -14607,7 +14691,7 @@
       </w:r>
     </w:p>
     <w:sectPr>
-      <w:footerReference w:type="default" r:id="rId65"/>
+      <w:footerReference w:type="default" r:id="rId66"/>
       <w:pgSz w:w="11910" w:h="16840"/>
       <w:pgMar w:top="1134" w:right="567" w:bottom="1134" w:left="1701" w:header="709" w:footer="709" w:gutter="0"/>
       <w:pgNumType w:start="1"/>
@@ -14703,7 +14787,7 @@
         <w:sz w:val="28"/>
         <w:szCs w:val="28"/>
       </w:rPr>
-      <w:t>36</w:t>
+      <w:t>45</w:t>
     </w:r>
     <w:r>
       <w:rPr>
@@ -32538,7 +32622,7 @@
 </file>
 
 <file path=customXml/itemProps2.xml><?xml version="1.0" encoding="utf-8"?>
-<ds:datastoreItem xmlns:ds="http://schemas.openxmlformats.org/officeDocument/2006/customXml" ds:itemID="{11481646-20D3-4C63-A681-23ED26AA6B34}">
+<ds:datastoreItem xmlns:ds="http://schemas.openxmlformats.org/officeDocument/2006/customXml" ds:itemID="{3F326999-711D-4E8B-909C-41E8156870CA}">
   <ds:schemaRefs>
     <ds:schemaRef ds:uri="http://schemas.openxmlformats.org/officeDocument/2006/bibliography"/>
   </ds:schemaRefs>

</xml_diff>